<commit_message>
Polish manuscript and add Zenodo DOI
</commit_message>
<xml_diff>
--- a/outputs/donor_disease_aware_sc_aging_submission_ready_v2.docx
+++ b/outputs/donor_disease_aware_sc_aging_submission_ready_v2.docx
@@ -124,7 +124,7 @@
         <w:spacing w:line="480" w:lineRule="auto"/>
       </w:pPr>
       <w:r>
-        <w:t>Background: Public single-cell atlases and hosted embeddings are increasingly reused for prediction tasks, but random-cell splits can overestimate generalizable performance when labels are structured by donor identity, disease status, assay, or study origin. Aging prediction from public metadata-derived labels is especially vulnerable to this problem because age groups may be unevenly distributed across datasets.</w:t>
+        <w:t>Background: Public single-cell atlases now provide reusable embeddings for prediction tasks. These resources also create a validation problem. Random-cell splits can overestimate generalizable performance when age labels track donor identity, disease status, assay, or study origin.</w:t>
       </w:r>
     </w:p>
     <w:p>
@@ -132,7 +132,7 @@
         <w:spacing w:line="480" w:lineRule="auto"/>
       </w:pPr>
       <w:r>
-        <w:t>Methods: We developed a leakage-aware computational benchmark for CELLxGENE-hosted public single-cell resources. After a metadata feasibility audit of CELLxGENE Census release 2025-11-08, we completed the empirical benchmark in blood T cells. Young and old donors were defined using development-stage-derived numeric ages of &lt;=40 and &gt;=60 years. The benchmark used 140 balanced donors and 1075 sampled cells, with a separate disease-free subset of 140 donors and 1091 cells. We evaluated CELLxGENE-hosted scVI and TranscriptFormer TF-Sapiens embeddings, donor-mean embeddings, and a metadata-only baseline using 30 repeated seeds across random-cell, donor-holdout, grouped dataset-holdout, disease-free, label-shuffling, leave-one-dataset-out feasibility, confounding, and sampling-depth analyses.</w:t>
+        <w:t>Methods: We built a leakage-aware benchmark for CELLxGENE-hosted public single-cell resources. After auditing CELLxGENE Census release 2025-11-08, we completed the empirical benchmark in blood T cells. Young and old donors were defined from development_stage-derived numeric ages of &lt;=40 and &gt;=60 years. The benchmark included 140 balanced donors and 1075 sampled cells. A disease-free subset included 140 donors and 1091 cells. We evaluated hosted scVI and TranscriptFormer TF-Sapiens embeddings, donor-mean embeddings, and a metadata-only baseline across 30 repeated seeds.</w:t>
       </w:r>
     </w:p>
     <w:p>
@@ -140,7 +140,7 @@
         <w:spacing w:line="480" w:lineRule="auto"/>
       </w:pPr>
       <w:r>
-        <w:t>Results: Random-cell AUROC in blood T cells was 0.769 (95% CI 0.762-0.776) for metadata alone, 0.749 (95% CI 0.744-0.754) for TranscriptFormer, and 0.707 (95% CI 0.699-0.716) for scVI, showing that metadata-only prediction exceeded or matched the hosted embedding models under the easiest split. Dataset-holdout AUROC was lower and more variable: 0.366 (95% CI 0.265-0.466) for metadata, 0.445 (95% CI 0.385-0.504) for TranscriptFormer, and 0.501 (95% CI 0.435-0.567) for scVI. Disease-free donor-holdout performance was stronger for donor-mean embeddings, reaching 0.905 (95% CI 0.896-0.915) for TranscriptFormer and 0.802 (95% CI 0.781-0.823) for scVI. LODO evaluation was feasible for only one held-out dataset, showing limited cross-study validation capacity under the available public metadata.</w:t>
+        <w:t>Results: Random-cell AUROC in blood T cells was 0.769 (95% CI 0.762-0.776) for metadata alone, 0.749 (95% CI 0.744-0.754) for TranscriptFormer, and 0.707 (95% CI 0.699-0.716) for scVI. Thus, metadata-only prediction exceeded or matched the hosted embedding models under the easiest split. Dataset-holdout AUROC was lower and more variable: 0.366 (95% CI 0.265-0.466) for metadata, 0.445 (95% CI 0.385-0.504) for TranscriptFormer, and 0.501 (95% CI 0.435-0.567) for scVI. Disease-free donor-holdout performance was strongest for donor-mean embeddings, reaching 0.905 (95% CI 0.896-0.915) for TranscriptFormer and 0.802 (95% CI 0.781-0.823) for scVI. LODO evaluation was feasible for one held-out dataset, showing limited cross-study validation capacity in the available metadata.</w:t>
       </w:r>
     </w:p>
     <w:p>
@@ -148,7 +148,7 @@
         <w:spacing w:line="480" w:lineRule="auto"/>
       </w:pPr>
       <w:r>
-        <w:t>Conclusions: This study provides a reproducible public-data evaluation framework for hosted single-cell embeddings and aging prediction. The blood T-cell benchmark shows that random-cell evaluation can overestimate generalizable performance and that donor-, disease-, and dataset-aware diagnostics are necessary before interpreting public single-cell age-prediction results biologically.</w:t>
+        <w:t>Conclusions: This benchmark shows that random-cell evaluation can overstate generalizable blood T-cell aging prediction in public CELLxGENE data. Donor-, disease-, and dataset-aware diagnostics are needed before public single-cell age-prediction results are interpreted biologically.</w:t>
       </w:r>
     </w:p>
     <w:p>
@@ -180,7 +180,7 @@
         <w:spacing w:line="480" w:lineRule="auto"/>
       </w:pPr>
       <w:r>
-        <w:t>Public single-cell atlases are increasingly reused as computational benchmark resources because they combine large cell numbers, harmonized metadata, and reusable representation layers. The Human Cell Atlas, Human Cell Landscape, and Tabula Sapiens established shared infrastructures for cross-tissue and cross-study single-cell analysis [14-16]. CZ CELLxGENE Discover extends this ecosystem by aggregating public datasets and exposing hosted analysis resources, including embeddings that can be used without retraining every model from raw expression matrices [17].</w:t>
+        <w:t>Public single-cell atlases are now used not only as biological references, but also as benchmark resources. The Human Cell Atlas, Human Cell Landscape, and Tabula Sapiens established shared infrastructures for cross-tissue and cross-study analysis [14-16]. CZ CELLxGENE Discover extends this infrastructure by aggregating public datasets and exposing hosted resources, including embeddings that can be used without retraining each model from raw counts [17].</w:t>
       </w:r>
     </w:p>
     <w:p>
@@ -188,7 +188,7 @@
         <w:spacing w:line="480" w:lineRule="auto"/>
       </w:pPr>
       <w:r>
-        <w:t>Aging-related prediction is an attractive test case for hosted single-cell representations. Molecular clocks showed that age can be estimated from high-dimensional molecular profiles, and single-cell aging atlases have shown that age-associated structure can be cell-type- and tissue-dependent [1,2,7]. Human single-cell studies have reported age-associated structure in skin, transcriptomic age estimates, and skeletal muscle [8-10]. Multi-tissue aging resources further show why age-related structure should be evaluated in a cell-type-aware manner [11,12]. However, public atlas labels are observational metadata rather than randomized experimental labels, so prediction performance can reflect source structure as well as biological variation.</w:t>
+        <w:t>Aging prediction is a useful stress test for these hosted representations. Molecular clocks showed that age can be estimated from high-dimensional molecular profiles [1,2]. Single-cell aging studies then showed that age-associated structure can vary by tissue and cell type [7-9]. Other human and multi-tissue resources support the same cell-type-aware framing [10-12]. In public atlases, however, age labels are observational metadata. Prediction performance can reflect how donors, studies, assays, and diseases are distributed, not only cellular aging biology.</w:t>
       </w:r>
     </w:p>
     <w:p>
@@ -196,7 +196,7 @@
         <w:spacing w:line="480" w:lineRule="auto"/>
       </w:pPr>
       <w:r>
-        <w:t>This problem is especially important when age labels are derived from public metadata. Age groups can be unevenly distributed across donors, diseases, assays, studies, and recruitment settings. Best-practice guidance and integration methods show that preprocessing and latent representations can strongly shape downstream analyses [25-27]. Batch effects can dominate benchmark behavior if they are not explicitly diagnosed [28-30]. Atlas-scale dataset composition creates a related source of downstream instability [31]. A public-data benchmark therefore needs to evaluate metadata leakage and dataset shift, not only random-split accuracy.</w:t>
+        <w:t>This distinction matters when age is parsed from public metadata fields. Age groups may be unevenly distributed across recruitment settings, assay types, datasets, diseases, and donor attributes. Best-practice guidance and integration methods show that preprocessing and latent representations can shape downstream analyses [25-27]. Batch effects can dominate benchmark behavior if they are not measured directly [28-30]. Atlas composition creates a related source of benchmark instability [31].</w:t>
       </w:r>
     </w:p>
     <w:p>
@@ -204,7 +204,7 @@
         <w:spacing w:line="480" w:lineRule="auto"/>
       </w:pPr>
       <w:r>
-        <w:t>Representation models add another reason for careful validation. scVI established a probabilistic latent-variable framework for single-cell expression [18,19]. Transcriptomic representation models such as Geneformer, scGPT, and scFoundation expanded the space of reusable cellular embeddings [20-22]. GeneCompass and TranscriptFormer further illustrate the rapid movement toward pretrained transcriptomic representations [23,24]. These models can encode useful biological structure, but flexible embeddings can also preserve study, assay, and cohort structure. The present study directly evaluates only CELLxGENE-hosted scVI and TranscriptFormer representations.</w:t>
+        <w:t>Representation models make this validation problem more pressing. scVI introduced a probabilistic latent-variable framework for single-cell expression [18,19]. Transcriptomic representation models such as Geneformer, scGPT, and scFoundation have expanded the set of reusable cellular embeddings [20-22]. GeneCompass and TranscriptFormer further illustrate the move toward pretrained transcriptomic representations [23,24]. These models can encode biological structure, but they can also retain study, assay, and cohort structure. This study directly evaluates CELLxGENE-hosted scVI and TranscriptFormer embeddings.</w:t>
       </w:r>
     </w:p>
     <w:p>
@@ -212,7 +212,7 @@
         <w:spacing w:line="480" w:lineRule="auto"/>
       </w:pPr>
       <w:r>
-        <w:t>Previous single-cell aging atlases and representation-model studies have not, by themselves, provided a donor-, disease-, and study-aware benchmark for aging-related prediction from hosted public embeddings. In particular, a computational benchmark should include metadata-only baselines, donor-aware splitting, disease-free sensitivity analysis, grouped dataset-holdout evaluation, label-shuffling controls, LODO feasibility diagnostics, and sampling-depth sensitivity. These design choices follow broader biomedical machine-learning concerns about leakage and small-sample validation [39,40]. They also reflect reporting and validation guidance for prediction models and external validation [41-43]. Clinical AI evaluation guidance reinforces the same need for transparent validation and conservative interpretation [44,45]. Dataset-shift and causal-interpretation limits are especially important when public metadata define both labels and sources [46,47].</w:t>
+        <w:t>Previous single-cell aging atlases and representation-model studies have not provided a donor-, disease-, and study-aware benchmark for hosted public embeddings. A useful benchmark should include metadata-only baselines, donor-aware splitting, disease-free sensitivity analysis, grouped dataset-holdout evaluation, label-shuffling controls, LODO feasibility diagnostics, and sampling-depth sensitivity. These design choices follow concerns about leakage and small-sample validation [39,40]. They also draw on prediction-model reporting and external-validation guidance [41-43]. Clinical AI evaluation supports conservative interpretation of public-data prediction results [44,45]. Dataset-shift and causal-interpretation limits further motivate source-aware benchmarking [46,47].</w:t>
       </w:r>
     </w:p>
     <w:p>
@@ -220,7 +220,7 @@
         <w:spacing w:line="480" w:lineRule="auto"/>
       </w:pPr>
       <w:r>
-        <w:t>Here, we contribute a leakage-aware benchmark workflow for hosted single-cell representations in public aging-related prediction, using blood T cells as the completed empirical stratum. The goal is not to claim a pan-tissue human aging predictor, but to provide a reproducible public-data evaluation framework that tests whether apparent prediction behavior persists under donor-, disease-, and study-aware controls.</w:t>
+        <w:t>We therefore developed a leakage-aware benchmark for hosted single-cell embeddings in public aging prediction. Blood T cells are the completed empirical stratum. The aim is a reproducible validation framework, not a pan-tissue aging predictor.</w:t>
       </w:r>
     </w:p>
     <w:p>
@@ -315,7 +315,7 @@
         <w:spacing w:line="480" w:lineRule="auto"/>
       </w:pPr>
       <w:r>
-        <w:t>The blood T-cell benchmark used 140 donors balanced by age group and sampled up to eight cells per donor, yielding 1075 cells. A disease-free subset was sampled independently with 140 donors and 1091 cells. Hosted embeddings were retrieved for scVI and TranscriptFormer TF-Sapiens from the same Census release and cached locally in the project reproducibility directory.</w:t>
+        <w:t>The blood T-cell benchmark used 140 donors balanced by age group and sampled up to eight cells per donor, yielding 1075 cells. A disease-free subset was sampled independently with 140 donors and 1091 cells. Hosted scVI and TranscriptFormer TF-Sapiens embeddings were retrieved from the same Census release and cached locally.</w:t>
       </w:r>
     </w:p>
     <w:p>
@@ -323,7 +323,7 @@
         <w:spacing w:line="480" w:lineRule="auto"/>
       </w:pPr>
       <w:r>
-        <w:t>Cell-level models used logistic regression with class weighting. The metadata-only baseline used dataset_id, assay, disease, and sex. Embedding models used either the cell-level hosted embedding or the donor-level mean embedding created by averaging sampled cells within each donor. This baseline was included to quantify how much aging-related prediction could be obtained from source metadata alone.</w:t>
+        <w:t>Cell-level models used class-weighted logistic regression. The metadata-only baseline used dataset_id, assay, disease, and sex. Embedding models used either cell-level hosted embeddings or donor-mean embeddings created by averaging sampled cells within each donor. The metadata-only baseline measured how much age prediction could be obtained from source metadata alone.</w:t>
       </w:r>
     </w:p>
     <w:p>
@@ -387,7 +387,7 @@
         <w:spacing w:line="480" w:lineRule="auto"/>
       </w:pPr>
       <w:r>
-        <w:t>The benchmark was organized around explicit leakage and confounding risks. Donor leakage was assessed by donor-holdout splits. Disease confounding was assessed by disease-free sensitivity analysis and disease metadata diagnostics. Study or dataset shift was assessed by grouped dataset-holdout and LODO feasibility diagnostics. Metadata-only predictability was assessed by the metadata-only baseline. Spurious label structure was assessed by label-shuffling controls. Donor aggregation sensitivity was assessed by sampling-depth sensitivity for donor-mean embeddings.</w:t>
+        <w:t>The benchmark targeted specific leakage and confounding risks. Donor-holdout splits assessed donor leakage. Disease-free analyses assessed disease confounding. Grouped dataset-holdout and LODO analyses assessed study shift. The metadata-only baseline measured source predictability. Label shuffling tested spurious label structure. Sampling-depth analysis tested donor-mean aggregation sensitivity.</w:t>
       </w:r>
     </w:p>
     <w:p>
@@ -411,7 +411,7 @@
         <w:spacing w:line="480" w:lineRule="auto"/>
       </w:pPr>
       <w:r>
-        <w:t>The metadata audit retrieved 7,149,649 target primary-cell rows from 7,255 donors, 360 datasets, 193 collections, and 68 tissues. Eighteen tissue-cell strata met the primary proxy-based eligibility threshold, whereas 98 met pilot-candidate criteria.</w:t>
+        <w:t>The metadata audit retrieved 7,149,649 target primary-cell rows from 7,255 donors, 360 datasets, 193 collections, and 68 tissues. Eighteen tissue-cell strata met the primary proxy-based eligibility threshold. Ninety-eight met pilot-candidate criteria.</w:t>
       </w:r>
     </w:p>
     <w:p>
@@ -513,7 +513,7 @@
         <w:spacing w:line="480" w:lineRule="auto"/>
       </w:pPr>
       <w:r>
-        <w:t>Threshold sensitivity showed that eligibility depended on the donor and disease-free criteria. The primary threshold yielded 18 eligible strata, whereas the stricter rule requiring at least 40 donors and disease-free retention of 0.60 yielded 14 eligible strata.</w:t>
+        <w:t>Threshold sensitivity showed that eligibility depended on donor-count and disease-free retention criteria. The primary threshold yielded 18 eligible strata. A stricter rule requiring at least 40 donors and disease-free retention of 0.60 yielded 14 eligible strata.</w:t>
       </w:r>
     </w:p>
     <w:p>
@@ -576,7 +576,7 @@
         <w:spacing w:line="480" w:lineRule="auto"/>
       </w:pPr>
       <w:r>
-        <w:t>In blood T cells, random-cell AUROC was 0.769 (95% CI 0.762-0.776) for metadata alone, 0.749 (95% CI 0.744-0.754) for TranscriptFormer, and 0.707 (95% CI 0.699-0.716) for scVI. Metadata-only random-cell performance therefore exceeded TranscriptFormer and scVI cell-level performance, showing that dataset, assay, disease, and sex carried substantial age-predictive structure in the sampled public data.</w:t>
+        <w:t>In blood T cells, random-cell AUROC was 0.769 (95% CI 0.762-0.776) for metadata alone, 0.749 (95% CI 0.744-0.754) for TranscriptFormer, and 0.707 (95% CI 0.699-0.716) for scVI. Metadata-only random-cell performance exceeded both cell-level embedding models. Dataset, assay, disease, and sex carried substantial age-predictive structure in the sampled public data.</w:t>
       </w:r>
     </w:p>
     <w:p>
@@ -639,7 +639,7 @@
         <w:spacing w:line="480" w:lineRule="auto"/>
       </w:pPr>
       <w:r>
-        <w:t>Donor-holdout AUROC was lower than or comparable to random-cell performance for cell-level embeddings, reaching 0.701 (95% CI 0.689-0.713) for TranscriptFormer and 0.671 (95% CI 0.654-0.688) for scVI. Donor-level mean embeddings improved donor-holdout performance to 0.855 (95% CI 0.837-0.874) for TranscriptFormer and 0.763 (95% CI 0.737-0.789) for scVI, indicating that donor-level aggregation changed prediction behavior.</w:t>
+        <w:t>Donor-holdout AUROC was lower than or comparable to random-cell performance for cell-level embeddings. It reached 0.701 (95% CI 0.689-0.713) for TranscriptFormer and 0.671 (95% CI 0.654-0.688) for scVI. Donor-mean embeddings increased donor-holdout AUROC to 0.855 (95% CI 0.837-0.874) for TranscriptFormer and 0.763 (95% CI 0.737-0.789) for scVI.</w:t>
       </w:r>
     </w:p>
     <w:p>
@@ -647,7 +647,7 @@
         <w:spacing w:line="480" w:lineRule="auto"/>
       </w:pPr>
       <w:r>
-        <w:t>Dataset-holdout AUROC was lower and more variable: 0.366 (95% CI 0.265-0.466) for metadata alone, 0.445 (95% CI 0.385-0.504) for TranscriptFormer, and 0.501 (95% CI 0.435-0.567) for scVI. These results indicate that apparent aging-related prediction was sensitive to study composition and dataset shift.</w:t>
+        <w:t>Dataset-holdout AUROC was lower and more variable. It was 0.366 (95% CI 0.265-0.466) for metadata alone, 0.445 (95% CI 0.385-0.504) for TranscriptFormer, and 0.501 (95% CI 0.435-0.567) for scVI. Apparent aging prediction was sensitive to study composition and dataset shift.</w:t>
       </w:r>
     </w:p>
     <w:p>
@@ -710,7 +710,7 @@
         <w:spacing w:line="480" w:lineRule="auto"/>
       </w:pPr>
       <w:r>
-        <w:t>Age labels were unevenly distributed across dataset, disease, assay, and sex. The metadata-only coefficient analysis identified source and assay categories with large old-versus-young coefficients, and embedding principal components also showed visible alignment with non-age metadata. These diagnostics support treating metadata baselines as an essential benchmark component.</w:t>
+        <w:t>Age labels were unevenly distributed across dataset, disease, assay, and sex. The metadata-only coefficient analysis identified source and assay categories with large old-versus-young coefficients. Embedding principal components also aligned visibly with non-age metadata. These diagnostics support including metadata baselines in public-data benchmarks.</w:t>
       </w:r>
     </w:p>
     <w:p>
@@ -820,7 +820,7 @@
         <w:spacing w:line="480" w:lineRule="auto"/>
       </w:pPr>
       <w:r>
-        <w:t>Only one dataset met LODO eligibility after requiring both age classes in the held-out set. This held-out dataset contained 98 donors and 767 cells. Across the eligible LODO test, AUROC ranged from 0.519 to 0.630 across models, with the highest value observed for TranscriptFormer_embedding_logistic. The remaining 12 datasets were excluded because they lacked sufficient young and old donors. LODO feasibility is therefore itself a diagnostic result, indicating that public metadata provided limited cross-study validation capacity for this stratum.</w:t>
+        <w:t>Only one dataset met LODO eligibility after requiring both age classes in the held-out set. This dataset contained 98 donors and 767 cells. Across the eligible LODO test, AUROC ranged from 0.519 to 0.630 across models. The highest value was observed for TranscriptFormer_embedding_logistic. The remaining 12 datasets were excluded because they lacked sufficient young and old donors. LODO feasibility was itself a diagnostic result, showing limited cross-study validation capacity in this stratum.</w:t>
       </w:r>
     </w:p>
     <w:p>
@@ -828,7 +828,7 @@
         <w:spacing w:line="480" w:lineRule="auto"/>
       </w:pPr>
       <w:r>
-        <w:t>In the disease-free donor-holdout subset, cell-level AUROC was 0.790 (95% CI 0.778-0.802) for TranscriptFormer and 0.681 (95% CI 0.666-0.695) for scVI. Donor-level mean embeddings increased performance to 0.905 (95% CI 0.896-0.915) and 0.802 (95% CI 0.781-0.823), respectively. This result describes benchmark behavior after disease-status restriction within the available public metadata and does not establish a biological aging mechanism.</w:t>
+        <w:t>In the disease-free donor-holdout subset, cell-level AUROC was 0.790 (95% CI 0.778-0.802) for TranscriptFormer and 0.681 (95% CI 0.666-0.695) for scVI. Donor-mean embeddings increased performance to 0.905 (95% CI 0.896-0.915) and 0.802 (95% CI 0.781-0.823), respectively. This result describes benchmark behavior after disease-status restriction within the available public metadata.</w:t>
       </w:r>
     </w:p>
     <w:p>
@@ -836,7 +836,7 @@
         <w:spacing w:line="480" w:lineRule="auto"/>
       </w:pPr>
       <w:r>
-        <w:t>High disease-free donor-holdout AUROC does not remove residual dataset, assay, recruitment, or cohort effects. Disease-free filtering reduces one observed source of confounding, but donors can remain structured by study origin, technical protocol, source population, and metadata completeness.</w:t>
+        <w:t>High disease-free donor-holdout AUROC did not remove residual dataset, assay, recruitment, or cohort effects. Disease-free filtering reduced one observed source of confounding. Donors could still be structured by study origin, technical protocol, source population, and metadata completeness.</w:t>
       </w:r>
     </w:p>
     <w:p>
@@ -899,7 +899,7 @@
         <w:spacing w:line="480" w:lineRule="auto"/>
       </w:pPr>
       <w:r>
-        <w:t>Sampling-depth sensitivity showed monotonic gains from 1 to 8 cells per donor. TranscriptFormer donor-mean AUROC under donor holdout increased from 0.671 at one cell per donor to 0.855 at eight cells per donor. The requested 16-cell point was identical to the eight-cell point because the benchmark sample was capped at eight cells per donor.</w:t>
+        <w:t>Sampling-depth sensitivity showed monotonic gains from 1 to 8 cells per donor. TranscriptFormer donor-mean AUROC under donor holdout increased from 0.671 at one cell per donor to 0.855 at eight cells per donor. The 16-cell point matched the eight-cell point because the benchmark sample was capped at eight cells per donor.</w:t>
       </w:r>
     </w:p>
     <w:p>
@@ -2830,7 +2830,7 @@
         <w:spacing w:line="480" w:lineRule="auto"/>
       </w:pPr>
       <w:r>
-        <w:t>This manuscript presents a leakage-aware computational benchmark for public single-cell atlas reuse. Its main contribution is to show that prediction behavior changes substantially when evaluation moves from random-cell splitting to donor-, disease-, and study-aware diagnostics. This practical point is important for computational biology studies that reuse public CELLxGENE resources for supervised prediction.</w:t>
+        <w:t>This study provides a leakage-aware benchmark for reusing public single-cell atlases in supervised prediction. The main finding is straightforward: performance changed when evaluation moved from random-cell splitting to donor-, disease-, and study-aware diagnostics. That shift matters for studies built on CELLxGENE-hosted resources.</w:t>
       </w:r>
     </w:p>
     <w:p>
@@ -2838,7 +2838,7 @@
         <w:spacing w:line="480" w:lineRule="auto"/>
       </w:pPr>
       <w:r>
-        <w:t>Random-cell performance alone was insufficient. Metadata-only prediction reached a random-cell AUROC near 0.77, exceeding TranscriptFormer and scVI cell-level models under the same split. This indicates that source variables carried substantial age-related information in the benchmark sample. The pattern is consistent with prior single-cell integration work showing that batch, assay, and dataset structure can remain visible after representation learning or correction [27-29]. Related atlas-integration benchmarks also emphasize that dataset composition can influence downstream comparisons [30,31]. For public biological prediction benchmarks, metadata-only baselines should therefore be treated as standard controls rather than optional sensitivity analyses.</w:t>
+        <w:t>Random-cell performance alone gave an incomplete view. Metadata-only prediction reached a random-cell AUROC near 0.77 and exceeded both cell-level embedding models under the same split. Source variables therefore carried age-related information in the benchmark sample. This agrees with single-cell integration work showing that batch, assay, and dataset structure can remain visible after representation learning or correction [27-29]. Atlas-integration benchmarks also show that dataset composition can influence downstream comparisons [30,31].</w:t>
       </w:r>
     </w:p>
     <w:p>
@@ -2846,7 +2846,7 @@
         <w:spacing w:line="480" w:lineRule="auto"/>
       </w:pPr>
       <w:r>
-        <w:t>Dataset-aware evaluation provided the strongest dataset-shift diagnostic. Cell-level scVI and TranscriptFormer performance was lower under grouped dataset holdout, and the metadata baseline was also unstable. Public atlases aggregate studies with different recruitment frames, protocols, and disease composition, so donor-holdout evaluation alone cannot establish study-level transfer [14-16]. CELLxGENE-hosted resources make this evaluation practical, but do not remove source imbalance by themselves [17]. This interpretation is consistent with biomedical machine-learning studies that emphasize leakage control and external validation [39-41]. Transparent prediction-model reporting guidance makes the same point for validation design [42]. It also aligns with dataset-shift work showing that performance can change when deployment data differ from development data [46,47].</w:t>
+        <w:t>Dataset-aware evaluation gave the clearest dataset-shift diagnostic. Cell-level scVI and TranscriptFormer performance decreased under grouped dataset holdout. The metadata baseline was also unstable. Public atlases aggregate studies with different recruitment frames, protocols, and disease composition [14-16]. CELLxGENE-hosted resources make this evaluation practical, but they do not remove source imbalance [17]. Donor-holdout evaluation alone therefore cannot establish study-level transfer. Biomedical machine-learning studies have repeatedly identified leakage and validation design as sources of overoptimistic estimates [39-41]. Prediction-model reporting guidance makes external validation a separate requirement [42]. Dataset-shift studies make the transfer problem explicit when deployment data differ from development data [46,47].</w:t>
       </w:r>
     </w:p>
     <w:p>
@@ -2854,7 +2854,7 @@
         <w:spacing w:line="480" w:lineRule="auto"/>
       </w:pPr>
       <w:r>
-        <w:t>LODO feasibility was itself an informative result. Only one dataset contained enough young and old donors to support a held-out evaluation, while most datasets were excluded for age-class imbalance. This means that nominal dataset counts can overstate the effective external-validation structure available in public metadata. Reporting LODO exclusions therefore helps readers distinguish a large public atlas from a well-balanced cross-study benchmark.</w:t>
+        <w:t>LODO feasibility was an informative outcome, not only a setup step. Only one dataset contained enough young and old donors for held-out evaluation. Most datasets were excluded for age-class imbalance. Nominal dataset counts can therefore overstate the external-validation structure available in public metadata. Reporting LODO exclusions helps distinguish a large atlas from a balanced cross-study benchmark.</w:t>
       </w:r>
     </w:p>
     <w:p>
@@ -2862,7 +2862,7 @@
         <w:spacing w:line="480" w:lineRule="auto"/>
       </w:pPr>
       <w:r>
-        <w:t>Disease-free donor-holdout analyses showed strong performance for donor-mean embeddings, but the disease-free subset remains a public-metadata-derived cohort. Removing donors with overt disease annotations reduces one confounding axis, while residual dataset, assay, recruitment, cohort, and metadata-completeness effects can remain. The disease-free result therefore supports the need for layered diagnostics rather than replacing dataset-aware validation.</w:t>
+        <w:t>Disease-free donor-holdout analyses showed strong performance for donor-mean embeddings, but the disease-free subset still came from public metadata. Removing overt disease annotations reduced one confounding axis. Residual effects from dataset, assay, recruitment frame, cohort composition, and metadata completeness can remain. The disease-free analysis complements dataset-aware validation rather than replacing it.</w:t>
       </w:r>
     </w:p>
     <w:p>
@@ -2870,7 +2870,7 @@
         <w:spacing w:line="480" w:lineRule="auto"/>
       </w:pPr>
       <w:r>
-        <w:t>Donor-mean aggregation improved benchmark stability, particularly in disease-free donor-holdout analyses and sampling-depth sensitivity. Donor-level averaging may reduce cell-level sampling noise and better match the donor-level age label. The study boundary is that this is a computational observation about label unit, sampling depth, and hosted representation behavior, not evidence of a biological aging mechanism or a clinically validated predictor.</w:t>
+        <w:t>Donor-mean aggregation improved stability, especially in disease-free donor-holdout analyses and sampling-depth sensitivity. Donor-level averaging may reduce cell-level sampling noise and better match the donor-level age label. In this study, the result is a computational observation about label unit, sampling depth, and hosted embedding behavior. It is not a biological mechanism claim or a clinically validated predictor.</w:t>
       </w:r>
     </w:p>
     <w:p>
@@ -2878,7 +2878,7 @@
         <w:spacing w:line="480" w:lineRule="auto"/>
       </w:pPr>
       <w:r>
-        <w:t>The findings also clarify how hosted embeddings should be evaluated. scVI and TranscriptFormer provided useful representations for a public-data benchmark, but their apparent performance depended on split design, metadata structure, disease restriction, and aggregation level. Related models such as Geneformer, scGPT, and scFoundation were discussed as context, but were not directly benchmarked here [20-22]. GeneCompass was also background context rather than a directly evaluated model [23]. The manuscript should therefore be read as a hosted representation assessment for scVI and TranscriptFormer in blood T cells, not as a comparison of all single-cell foundation models.</w:t>
+        <w:t>The benchmark also defines the scope of the model comparison. scVI and TranscriptFormer provided useful hosted embeddings, but their apparent performance depended on split design, metadata structure, disease restriction, and aggregation level. Geneformer, scGPT, and scFoundation were discussed as related models, not as directly evaluated comparators [20-22]. GeneCompass was also background context rather than a tested model [23].</w:t>
       </w:r>
     </w:p>
     <w:p>
@@ -2886,7 +2886,7 @@
         <w:spacing w:line="480" w:lineRule="auto"/>
       </w:pPr>
       <w:r>
-        <w:t>Several limitations remain. The completed empirical benchmark is restricted to blood T cells. LODO evaluation was feasible for only one eligible held-out dataset. The study evaluates hosted scVI and TranscriptFormer embeddings, not all single-cell foundation models. No raw-expression benchmark or manual external metadata harmonization was added. Age was inferred from public development_stage labels rather than from a harmonized donor-age field. Repository DOI and archival links should be finalized before submission.</w:t>
+        <w:t>The main limitations follow from the public-data design. The completed empirical benchmark is restricted to blood T cells. LODO evaluation was feasible for one eligible held-out dataset. The study evaluates hosted scVI and TranscriptFormer embeddings, not all single-cell foundation models. It does not include a raw-expression benchmark or manual external metadata harmonization. Age was inferred from public development_stage labels rather than a harmonized donor-age field.</w:t>
       </w:r>
     </w:p>
     <w:p>
@@ -2894,7 +2894,7 @@
         <w:spacing w:line="480" w:lineRule="auto"/>
       </w:pPr>
       <w:r>
-        <w:t>Despite these limitations, the study provides a reproducible framework for metadata-aware validation of public single-cell prediction benchmarks. Its contribution is a workflow that connects metadata feasibility auditing, leakage diagnostics, source-aware splitting, label-shuffling controls, and sampling-depth sensitivity. This framing is aligned with reporting and reproducibility guidance for biomedical prediction studies, where transparent validation design is as important as point-estimate performance [41,42,49].</w:t>
+        <w:t>The resulting framework connects metadata feasibility auditing, leakage diagnostics, source-aware splitting, label-shuffling controls, and sampling-depth sensitivity. This structure is consistent with reporting and reproducibility guidance for biomedical prediction studies, where validation design matters as much as point-estimate performance [41,42,49].</w:t>
       </w:r>
     </w:p>
     <w:p>
@@ -2910,7 +2910,7 @@
         <w:spacing w:line="480" w:lineRule="auto"/>
       </w:pPr>
       <w:r>
-        <w:t>This blood T-cell benchmark shows that hosted single-cell representations can support aging-related prediction in public CELLxGENE data, but only when interpreted through metadata-aware validation. Metadata-only prediction, dataset-holdout fragility, and LODO exclusions show that public single-cell benchmarks are strongly constrained by donor, disease, and study structure. The proposed workflow provides a reproducible framework for leakage-aware hosted representation assessment rather than a pan-tissue human aging predictor.</w:t>
+        <w:t>This blood T-cell benchmark shows that hosted single-cell embeddings can support aging prediction in public CELLxGENE data when validation is metadata-aware. Metadata-only prediction, dataset-holdout fragility, and LODO exclusions show that donor, disease, and study structure constrain public single-cell benchmarks. The workflow provides a reproducible framework for leakage-aware hosted embedding assessment, not a pan-tissue human aging predictor.</w:t>
       </w:r>
     </w:p>
     <w:p>
@@ -3815,7 +3815,7 @@
         <w:spacing w:line="480" w:lineRule="auto"/>
       </w:pPr>
       <w:r>
-        <w:t>The analyses used CELLxGENE Census release 2025-11-08 and hosted embeddings from the same release. Project scripts, split definitions or deterministic split-generation code, target-source tables, QC outputs, benchmark outputs, figure source data, candidate-level feasibility results, and the output manifest are included in the reproducibility package and supplementary materials. The public GitHub repository is available at https://github.com/seefreewind/cellxgene-blood-tcell-aging-benchmark. [UNRESOLVED PLACEHOLDER: Zenodo DOI to be inserted before submission.] Public archival availability should not be inferred until the Zenodo DOI is finalized.</w:t>
+        <w:t>The analyses used CELLxGENE Census release 2025-11-08 and hosted embeddings from the same release. Project scripts, split definitions, deterministic split-generation code, target-source tables, QC outputs, benchmark outputs, figure source data, candidate-level feasibility results, and the output manifest are included in the reproducibility package. The public GitHub repository is available at https://github.com/seefreewind/cellxgene-blood-tcell-aging-benchmark. The archived Zenodo record is available at https://doi.org/10.5281/zenodo.21188101.</w:t>
       </w:r>
     </w:p>
     <w:p>

</xml_diff>